<commit_message>
feat: enhance role parsing and coverage reporting in resume search
- Introduced a mapping for role aliases to canonical values in `deps.py` to improve role handling.
- Added a `parse_role` function to safely convert raw role inputs into valid Role enums, raising HTTP exceptions for invalid inputs.
- Updated `build_cohort_answer` functions in both `certifications.py` and `languages.py` to include a coverage caveat, providing clearer feedback on resume data availability.

Co-authored-by: Cursor <cursoragent@cursor.com>
</commit_message>
<xml_diff>
--- a/backend/data/seed/resumes/2062f119-df7b-518f-8ad0-8d123aa55573.docx
+++ b/backend/data/seed/resumes/2062f119-df7b-518f-8ad0-8d123aa55573.docx
@@ -9,7 +9,7 @@
     </w:p>
     <w:p>
       <w:r>
-        <w:t>Experienced Sales Manager in Sales based in Paris, France.</w:t>
+        <w:t>Experienced Account Executive in Sales based in Paris, France.</w:t>
       </w:r>
     </w:p>
     <w:p/>
@@ -42,7 +42,7 @@
     </w:p>
     <w:p>
       <w:r>
-        <w:t>- Sales Manager at Acme Corp</w:t>
+        <w:t>- Account Executive at Acme Corp</w:t>
       </w:r>
     </w:p>
     <w:p>

</xml_diff>